<commit_message>
Update version 1.2 deployment and administration guides
</commit_message>
<xml_diff>
--- a/docs/Storage-Appliance-Administrator-Guide.docx
+++ b/docs/Storage-Appliance-Administrator-Guide.docx
@@ -29,7 +29,7 @@
           <w:color w:val="000000"/>
           <w:sz w:val="18"/>
         </w:rPr>
-        <w:t>Applies to appliance release 1.1.0 | Guide version 1.1 | October 6, 2026</w:t>
+        <w:t>Applies to appliance release 1.2.0 | Guide version 1.2 | October 7, 2026</w:t>
       </w:r>
     </w:p>
     <w:p>
@@ -74,7 +74,7 @@
           <w:rFonts w:ascii="Arial" w:hAnsi="Arial"/>
           <w:color w:val="000000"/>
         </w:rPr>
-        <w:t>This guide describes the signed GA 1.1.0 production release. The exact OVA passed 167 Linux unit and security tests, OVF and signature checks, and an import and first-boot smoke test. Version 1.0.3 remains the most recently completed full guided-setup and end-to-end service qualification baseline.</w:t>
+        <w:t>This guide describes the signed GA 1.2.0 production release. The exact OVA passed 167 Linux unit and security tests, OVF and signature checks, and an import and first-boot smoke test. The signed 1.2.0 in-place update was also validated on the live appliance with its accounts, service configuration, and stored data preserved.</w:t>
       </w:r>
     </w:p>
     <w:p>
@@ -2112,7 +2112,7 @@
           <w:rFonts w:ascii="Arial" w:hAnsi="Arial"/>
           <w:color w:val="000000"/>
         </w:rPr>
-        <w:t>Generate or enter an SFTP password, then use Show password or Copy password before saving. The interface never redisplays a saved password; rotate it when the original value was not recorded.</w:t>
+        <w:t>Generate a 19-character SFTP password or enter an approved value, then use Show password or Copy password before saving. The interface never redisplays a saved password; rotate it when the original value was not recorded.</w:t>
       </w:r>
     </w:p>
     <w:p>
@@ -2691,7 +2691,7 @@
           <w:rFonts w:ascii="Arial" w:hAnsi="Arial"/>
           <w:color w:val="000000"/>
         </w:rPr>
-        <w:t>Offline vulnerability-database refresh and scanner operation are outside the GA 1.1 supported scope. Do not represent scan freshness as healthy until that workflow is separately approved and qualified.</w:t>
+        <w:t>Offline vulnerability-database refresh and scanner operation are outside the GA 1.2 supported scope. Do not represent scan freshness as healthy until that workflow is separately approved and qualified.</w:t>
       </w:r>
     </w:p>
     <w:p>
@@ -4198,7 +4198,7 @@
         <w:color w:val="000000"/>
         <w:sz w:val="16"/>
       </w:rPr>
-      <w:t xml:space="preserve">Internal operator reference    |    Applies to 1.1.0    |    </w:t>
+      <w:t xml:space="preserve">Internal operator reference    |    Applies to 1.2.0    |    </w:t>
     </w:r>
     <w:r>
       <w:rPr>

</xml_diff>